<commit_message>
Retrival based on difficulty level
</commit_message>
<xml_diff>
--- a/Typing_test/typing_log.docx
+++ b/Typing_test/typing_log.docx
@@ -1688,22 +1688,6 @@
           <w:bCs/>
         </w:rPr>
       </w:pPr>
-    </w:p>
-    <w:p>
-      <w:pPr>
-        <w:rPr>
-          <w:b/>
-          <w:bCs/>
-        </w:rPr>
-      </w:pPr>
-    </w:p>
-    <w:p>
-      <w:pPr>
-        <w:rPr>
-          <w:b/>
-          <w:bCs/>
-        </w:rPr>
-      </w:pPr>
       <w:r>
         <w:rPr>
           <w:b/>
@@ -1721,6 +1705,283 @@
           <w:bCs/>
         </w:rPr>
       </w:pPr>
+      <w:r>
+        <w:rPr>
+          <w:b/>
+          <w:bCs/>
+        </w:rPr>
+        <w:t>Initialised test sessions</w:t>
+      </w:r>
+    </w:p>
+    <w:p>
+      <w:pPr>
+        <w:rPr>
+          <w:b/>
+          <w:bCs/>
+        </w:rPr>
+      </w:pPr>
+      <w:r>
+        <w:rPr>
+          <w:b/>
+          <w:bCs/>
+        </w:rPr>
+        <w:t xml:space="preserve">Validation part for test sessions regarding the submission inputs to the </w:t>
+      </w:r>
+      <w:proofErr w:type="spellStart"/>
+      <w:proofErr w:type="gramStart"/>
+      <w:r>
+        <w:rPr>
+          <w:b/>
+          <w:bCs/>
+        </w:rPr>
+        <w:t>db</w:t>
+      </w:r>
+      <w:proofErr w:type="spellEnd"/>
+      <w:r>
+        <w:rPr>
+          <w:b/>
+          <w:bCs/>
+        </w:rPr>
+        <w:t xml:space="preserve"> :</w:t>
+      </w:r>
+      <w:proofErr w:type="gramEnd"/>
+    </w:p>
+    <w:p>
+      <w:pPr>
+        <w:ind w:left="1440"/>
+        <w:rPr>
+          <w:b/>
+          <w:bCs/>
+        </w:rPr>
+      </w:pPr>
+      <w:r>
+        <w:rPr>
+          <w:b/>
+          <w:bCs/>
+        </w:rPr>
+        <w:t>Security Principle</w:t>
+      </w:r>
+      <w:r>
+        <w:rPr>
+          <w:b/>
+          <w:bCs/>
+        </w:rPr>
+        <w:t xml:space="preserve"> - </w:t>
+      </w:r>
+      <w:r>
+        <w:rPr>
+          <w:b/>
+          <w:bCs/>
+        </w:rPr>
+        <w:t>Backend should never trust client</w:t>
+      </w:r>
+      <w:r>
+        <w:rPr>
+          <w:b/>
+          <w:bCs/>
+        </w:rPr>
+        <w:t>, e</w:t>
+      </w:r>
+      <w:r>
+        <w:rPr>
+          <w:b/>
+          <w:bCs/>
+        </w:rPr>
+        <w:t>ven if client is yours.</w:t>
+      </w:r>
+    </w:p>
+    <w:p>
+      <w:pPr>
+        <w:ind w:left="1440"/>
+        <w:rPr>
+          <w:b/>
+          <w:bCs/>
+        </w:rPr>
+      </w:pPr>
+      <w:r>
+        <w:rPr>
+          <w:b/>
+          <w:bCs/>
+        </w:rPr>
+        <w:t>Industry rule:</w:t>
+      </w:r>
+    </w:p>
+    <w:p>
+      <w:pPr>
+        <w:ind w:left="1440" w:firstLine="720"/>
+        <w:rPr>
+          <w:b/>
+          <w:bCs/>
+        </w:rPr>
+      </w:pPr>
+      <w:r>
+        <w:rPr>
+          <w:b/>
+          <w:bCs/>
+        </w:rPr>
+        <w:t>“Trust nothing. Validate everything.”</w:t>
+      </w:r>
+    </w:p>
+    <w:p>
+      <w:pPr>
+        <w:rPr>
+          <w:b/>
+          <w:bCs/>
+        </w:rPr>
+      </w:pPr>
+    </w:p>
+    <w:p>
+      <w:pPr>
+        <w:rPr>
+          <w:b/>
+          <w:bCs/>
+        </w:rPr>
+      </w:pPr>
+      <w:r>
+        <w:rPr>
+          <w:b/>
+          <w:bCs/>
+        </w:rPr>
+        <w:t>When to throw and respond the error</w:t>
+      </w:r>
+    </w:p>
+    <w:p>
+      <w:pPr>
+        <w:pStyle w:val="ListParagraph"/>
+        <w:numPr>
+          <w:ilvl w:val="0"/>
+          <w:numId w:val="7"/>
+        </w:numPr>
+        <w:rPr>
+          <w:b/>
+          <w:bCs/>
+        </w:rPr>
+      </w:pPr>
+      <w:r>
+        <w:rPr>
+          <w:b/>
+          <w:bCs/>
+        </w:rPr>
+        <w:t>if</w:t>
+      </w:r>
+      <w:proofErr w:type="gramStart"/>
+      <w:r>
+        <w:rPr>
+          <w:b/>
+          <w:bCs/>
+        </w:rPr>
+        <w:t>(!doc</w:t>
+      </w:r>
+      <w:proofErr w:type="gramEnd"/>
+      <w:r>
+        <w:rPr>
+          <w:b/>
+          <w:bCs/>
+        </w:rPr>
+        <w:t>) {</w:t>
+      </w:r>
+    </w:p>
+    <w:p>
+      <w:pPr>
+        <w:ind w:left="720"/>
+        <w:rPr>
+          <w:b/>
+          <w:bCs/>
+        </w:rPr>
+      </w:pPr>
+      <w:r>
+        <w:rPr>
+          <w:b/>
+          <w:bCs/>
+        </w:rPr>
+        <w:lastRenderedPageBreak/>
+        <w:t xml:space="preserve">        throw new </w:t>
+      </w:r>
+      <w:proofErr w:type="gramStart"/>
+      <w:r>
+        <w:rPr>
+          <w:b/>
+          <w:bCs/>
+        </w:rPr>
+        <w:t>Error(</w:t>
+      </w:r>
+      <w:proofErr w:type="gramEnd"/>
+      <w:r>
+        <w:rPr>
+          <w:b/>
+          <w:bCs/>
+        </w:rPr>
+        <w:t>"No documents available");</w:t>
+      </w:r>
+    </w:p>
+    <w:p>
+      <w:pPr>
+        <w:ind w:left="720"/>
+        <w:rPr>
+          <w:b/>
+          <w:bCs/>
+        </w:rPr>
+      </w:pPr>
+      <w:r>
+        <w:rPr>
+          <w:b/>
+          <w:bCs/>
+        </w:rPr>
+        <w:t>    }</w:t>
+      </w:r>
+    </w:p>
+    <w:p>
+      <w:pPr>
+        <w:pStyle w:val="ListParagraph"/>
+        <w:numPr>
+          <w:ilvl w:val="0"/>
+          <w:numId w:val="7"/>
+        </w:numPr>
+      </w:pPr>
+      <w:r>
+        <w:t xml:space="preserve">return </w:t>
+      </w:r>
+      <w:proofErr w:type="spellStart"/>
+      <w:proofErr w:type="gramStart"/>
+      <w:r>
+        <w:t>res.status</w:t>
+      </w:r>
+      <w:proofErr w:type="spellEnd"/>
+      <w:proofErr w:type="gramEnd"/>
+      <w:r>
+        <w:t>(400</w:t>
+      </w:r>
+      <w:proofErr w:type="gramStart"/>
+      <w:r>
+        <w:t>).</w:t>
+      </w:r>
+      <w:proofErr w:type="spellStart"/>
+      <w:r>
+        <w:t>json</w:t>
+      </w:r>
+      <w:proofErr w:type="spellEnd"/>
+      <w:proofErr w:type="gramEnd"/>
+      <w:r>
+        <w:t>({</w:t>
+      </w:r>
+    </w:p>
+    <w:p>
+      <w:pPr>
+        <w:pStyle w:val="ListParagraph"/>
+        <w:ind w:left="1080"/>
+      </w:pPr>
+      <w:r>
+        <w:t xml:space="preserve">    errors</w:t>
+      </w:r>
+    </w:p>
+    <w:p>
+      <w:pPr>
+        <w:pStyle w:val="ListParagraph"/>
+        <w:ind w:left="1080"/>
+      </w:pPr>
+      <w:r>
+        <w:t xml:space="preserve"> });</w:t>
+      </w:r>
     </w:p>
     <w:p>
       <w:r>
@@ -2394,6 +2655,95 @@
     </w:lvl>
   </w:abstractNum>
   <w:abstractNum w:abstractNumId="5" w15:restartNumberingAfterBreak="0">
+    <w:nsid w:val="70F3702D"/>
+    <w:multiLevelType w:val="hybridMultilevel"/>
+    <w:tmpl w:val="D5940FAE"/>
+    <w:lvl w:ilvl="0" w:tplc="AF4A4066">
+      <w:start w:val="1"/>
+      <w:numFmt w:val="decimal"/>
+      <w:lvlText w:val="%1."/>
+      <w:lvlJc w:val="left"/>
+      <w:pPr>
+        <w:ind w:left="1080" w:hanging="360"/>
+      </w:pPr>
+      <w:rPr>
+        <w:rFonts w:hint="default"/>
+      </w:rPr>
+    </w:lvl>
+    <w:lvl w:ilvl="1" w:tplc="40090019" w:tentative="1">
+      <w:start w:val="1"/>
+      <w:numFmt w:val="lowerLetter"/>
+      <w:lvlText w:val="%2."/>
+      <w:lvlJc w:val="left"/>
+      <w:pPr>
+        <w:ind w:left="1800" w:hanging="360"/>
+      </w:pPr>
+    </w:lvl>
+    <w:lvl w:ilvl="2" w:tplc="4009001B" w:tentative="1">
+      <w:start w:val="1"/>
+      <w:numFmt w:val="lowerRoman"/>
+      <w:lvlText w:val="%3."/>
+      <w:lvlJc w:val="right"/>
+      <w:pPr>
+        <w:ind w:left="2520" w:hanging="180"/>
+      </w:pPr>
+    </w:lvl>
+    <w:lvl w:ilvl="3" w:tplc="4009000F" w:tentative="1">
+      <w:start w:val="1"/>
+      <w:numFmt w:val="decimal"/>
+      <w:lvlText w:val="%4."/>
+      <w:lvlJc w:val="left"/>
+      <w:pPr>
+        <w:ind w:left="3240" w:hanging="360"/>
+      </w:pPr>
+    </w:lvl>
+    <w:lvl w:ilvl="4" w:tplc="40090019" w:tentative="1">
+      <w:start w:val="1"/>
+      <w:numFmt w:val="lowerLetter"/>
+      <w:lvlText w:val="%5."/>
+      <w:lvlJc w:val="left"/>
+      <w:pPr>
+        <w:ind w:left="3960" w:hanging="360"/>
+      </w:pPr>
+    </w:lvl>
+    <w:lvl w:ilvl="5" w:tplc="4009001B" w:tentative="1">
+      <w:start w:val="1"/>
+      <w:numFmt w:val="lowerRoman"/>
+      <w:lvlText w:val="%6."/>
+      <w:lvlJc w:val="right"/>
+      <w:pPr>
+        <w:ind w:left="4680" w:hanging="180"/>
+      </w:pPr>
+    </w:lvl>
+    <w:lvl w:ilvl="6" w:tplc="4009000F" w:tentative="1">
+      <w:start w:val="1"/>
+      <w:numFmt w:val="decimal"/>
+      <w:lvlText w:val="%7."/>
+      <w:lvlJc w:val="left"/>
+      <w:pPr>
+        <w:ind w:left="5400" w:hanging="360"/>
+      </w:pPr>
+    </w:lvl>
+    <w:lvl w:ilvl="7" w:tplc="40090019" w:tentative="1">
+      <w:start w:val="1"/>
+      <w:numFmt w:val="lowerLetter"/>
+      <w:lvlText w:val="%8."/>
+      <w:lvlJc w:val="left"/>
+      <w:pPr>
+        <w:ind w:left="6120" w:hanging="360"/>
+      </w:pPr>
+    </w:lvl>
+    <w:lvl w:ilvl="8" w:tplc="4009001B" w:tentative="1">
+      <w:start w:val="1"/>
+      <w:numFmt w:val="lowerRoman"/>
+      <w:lvlText w:val="%9."/>
+      <w:lvlJc w:val="right"/>
+      <w:pPr>
+        <w:ind w:left="6840" w:hanging="180"/>
+      </w:pPr>
+    </w:lvl>
+  </w:abstractNum>
+  <w:abstractNum w:abstractNumId="6" w15:restartNumberingAfterBreak="0">
     <w:nsid w:val="71510B0D"/>
     <w:multiLevelType w:val="hybridMultilevel"/>
     <w:tmpl w:val="3042C6FE"/>
@@ -2485,7 +2835,7 @@
     </w:lvl>
   </w:abstractNum>
   <w:num w:numId="1" w16cid:durableId="1633435459">
-    <w:abstractNumId w:val="5"/>
+    <w:abstractNumId w:val="6"/>
   </w:num>
   <w:num w:numId="2" w16cid:durableId="163590598">
     <w:abstractNumId w:val="0"/>
@@ -2501,6 +2851,9 @@
   </w:num>
   <w:num w:numId="6" w16cid:durableId="1401564935">
     <w:abstractNumId w:val="4"/>
+  </w:num>
+  <w:num w:numId="7" w16cid:durableId="1869171665">
+    <w:abstractNumId w:val="5"/>
   </w:num>
 </w:numbering>
 </file>

</xml_diff>